<commit_message>
Make the human gate a choice between two vendors, and record where Doctavian stops
</commit_message>
<xml_diff>
--- a/assets/signet-authorisation.docx
+++ b/assets/signet-authorisation.docx
@@ -279,7 +279,7 @@
           <w:b w:val="0"/>
           <w:sz w:val="20"/>
         </w:rPr>
-        <w:t>Signature  ${signfield:1:y:____________}</w:t>
+        <w:t>Signature  ${signfield:1:y:____________}   _SIG_ISSUER_</w:t>
       </w:r>
     </w:p>
     <w:p>
@@ -293,7 +293,7 @@
           <w:b w:val="0"/>
           <w:sz w:val="20"/>
         </w:rPr>
-        <w:t>Date       ${datefield:1:y:Date_Signed:__________}</w:t>
+        <w:t>Date       ${datefield:1:y:Date_Signed:__________}   _DATE_ISSUER_</w:t>
       </w:r>
     </w:p>
     <w:sectPr>

</xml_diff>

<commit_message>
Hide the signing machinery, because a person is being asked to read this
</commit_message>
<xml_diff>
--- a/assets/signet-authorisation.docx
+++ b/assets/signet-authorisation.docx
@@ -228,7 +228,7 @@
     </w:p>
     <w:p>
       <w:pPr>
-        <w:spacing w:after="160"/>
+        <w:spacing w:after="200"/>
         <w:jc w:val="left"/>
       </w:pPr>
       <w:r>
@@ -242,7 +242,36 @@
     </w:p>
     <w:p>
       <w:pPr>
-        <w:spacing w:after="120"/>
+        <w:spacing w:after="40"/>
+        <w:jc w:val="left"/>
+      </w:pPr>
+      <w:r>
+        <w:rPr>
+          <w:rFonts w:ascii="Helvetica" w:hAnsi="Helvetica"/>
+          <w:b/>
+          <w:sz w:val="18"/>
+        </w:rPr>
+        <w:t>Name</w:t>
+      </w:r>
+    </w:p>
+    <w:p>
+      <w:pPr>
+        <w:spacing w:after="20"/>
+        <w:jc w:val="left"/>
+      </w:pPr>
+      <w:r>
+        <w:rPr>
+          <w:rFonts w:ascii="Helvetica" w:hAnsi="Helvetica"/>
+          <w:b w:val="0"/>
+          <w:color w:val="FFFFFF"/>
+          <w:sz w:val="20"/>
+        </w:rPr>
+        <w:t>${textfield:1:y:Signer_Name:________________}</w:t>
+      </w:r>
+    </w:p>
+    <w:p>
+      <w:pPr>
+        <w:spacing w:after="200"/>
         <w:jc w:val="left"/>
       </w:pPr>
       <w:r>
@@ -251,12 +280,41 @@
           <w:b w:val="0"/>
           <w:sz w:val="20"/>
         </w:rPr>
-        <w:t>Name       ${textfield:1:y:Signer_Name:________________}</w:t>
+        <w:t>______________________________________________</w:t>
       </w:r>
     </w:p>
     <w:p>
       <w:pPr>
-        <w:spacing w:after="120"/>
+        <w:spacing w:after="40"/>
+        <w:jc w:val="left"/>
+      </w:pPr>
+      <w:r>
+        <w:rPr>
+          <w:rFonts w:ascii="Helvetica" w:hAnsi="Helvetica"/>
+          <w:b/>
+          <w:sz w:val="18"/>
+        </w:rPr>
+        <w:t>Role</w:t>
+      </w:r>
+    </w:p>
+    <w:p>
+      <w:pPr>
+        <w:spacing w:after="20"/>
+        <w:jc w:val="left"/>
+      </w:pPr>
+      <w:r>
+        <w:rPr>
+          <w:rFonts w:ascii="Helvetica" w:hAnsi="Helvetica"/>
+          <w:b w:val="0"/>
+          <w:color w:val="FFFFFF"/>
+          <w:sz w:val="20"/>
+        </w:rPr>
+        <w:t>${textfield:1:y:Signer_Role:________________}</w:t>
+      </w:r>
+    </w:p>
+    <w:p>
+      <w:pPr>
+        <w:spacing w:after="200"/>
         <w:jc w:val="left"/>
       </w:pPr>
       <w:r>
@@ -265,12 +323,56 @@
           <w:b w:val="0"/>
           <w:sz w:val="20"/>
         </w:rPr>
-        <w:t>Role       ${textfield:1:y:Signer_Role:________________}</w:t>
+        <w:t>______________________________________________</w:t>
       </w:r>
     </w:p>
     <w:p>
       <w:pPr>
-        <w:spacing w:after="120"/>
+        <w:spacing w:after="40"/>
+        <w:jc w:val="left"/>
+      </w:pPr>
+      <w:r>
+        <w:rPr>
+          <w:rFonts w:ascii="Helvetica" w:hAnsi="Helvetica"/>
+          <w:b/>
+          <w:sz w:val="18"/>
+        </w:rPr>
+        <w:t>Signature</w:t>
+      </w:r>
+    </w:p>
+    <w:p>
+      <w:pPr>
+        <w:spacing w:after="20"/>
+        <w:jc w:val="left"/>
+      </w:pPr>
+      <w:r>
+        <w:rPr>
+          <w:rFonts w:ascii="Helvetica" w:hAnsi="Helvetica"/>
+          <w:b w:val="0"/>
+          <w:color w:val="FFFFFF"/>
+          <w:sz w:val="20"/>
+        </w:rPr>
+        <w:t>${signfield:1:y:______________________}</w:t>
+      </w:r>
+    </w:p>
+    <w:p>
+      <w:pPr>
+        <w:spacing w:after="20"/>
+        <w:jc w:val="left"/>
+      </w:pPr>
+      <w:r>
+        <w:rPr>
+          <w:rFonts w:ascii="Helvetica" w:hAnsi="Helvetica"/>
+          <w:b w:val="0"/>
+          <w:color w:val="FFFFFF"/>
+          <w:sz w:val="20"/>
+        </w:rPr>
+        <w:t>_SIGNET_SIGNATURE_ISSUER_HERE_</w:t>
+      </w:r>
+    </w:p>
+    <w:p>
+      <w:pPr>
+        <w:spacing w:after="200"/>
         <w:jc w:val="left"/>
       </w:pPr>
       <w:r>
@@ -279,7 +381,51 @@
           <w:b w:val="0"/>
           <w:sz w:val="20"/>
         </w:rPr>
-        <w:t>Signature  ${signfield:1:y:____________}   _SIG_ISSUER_</w:t>
+        <w:t>______________________________________________</w:t>
+      </w:r>
+    </w:p>
+    <w:p>
+      <w:pPr>
+        <w:spacing w:after="40"/>
+        <w:jc w:val="left"/>
+      </w:pPr>
+      <w:r>
+        <w:rPr>
+          <w:rFonts w:ascii="Helvetica" w:hAnsi="Helvetica"/>
+          <w:b/>
+          <w:sz w:val="18"/>
+        </w:rPr>
+        <w:t>Date</w:t>
+      </w:r>
+    </w:p>
+    <w:p>
+      <w:pPr>
+        <w:spacing w:after="20"/>
+        <w:jc w:val="left"/>
+      </w:pPr>
+      <w:r>
+        <w:rPr>
+          <w:rFonts w:ascii="Helvetica" w:hAnsi="Helvetica"/>
+          <w:b w:val="0"/>
+          <w:color w:val="FFFFFF"/>
+          <w:sz w:val="20"/>
+        </w:rPr>
+        <w:t>${datefield:1:y:Date_Signed:__________}</w:t>
+      </w:r>
+    </w:p>
+    <w:p>
+      <w:pPr>
+        <w:spacing w:after="20"/>
+        <w:jc w:val="left"/>
+      </w:pPr>
+      <w:r>
+        <w:rPr>
+          <w:rFonts w:ascii="Helvetica" w:hAnsi="Helvetica"/>
+          <w:b w:val="0"/>
+          <w:color w:val="FFFFFF"/>
+          <w:sz w:val="20"/>
+        </w:rPr>
+        <w:t>_SIGNET_DATE_ISSUER_HERE_</w:t>
       </w:r>
     </w:p>
     <w:p>
@@ -293,7 +439,7 @@
           <w:b w:val="0"/>
           <w:sz w:val="20"/>
         </w:rPr>
-        <w:t>Date       ${datefield:1:y:Date_Signed:__________}   _DATE_ISSUER_</w:t>
+        <w:t>______________________________</w:t>
       </w:r>
     </w:p>
     <w:sectPr>

</xml_diff>

<commit_message>
Resolve a brand by the domain it is named after, since Google has no entry for Maersk
</commit_message>
<xml_diff>
--- a/assets/signet-authorisation.docx
+++ b/assets/signet-authorisation.docx
@@ -352,12 +352,12 @@
           <w:color w:val="FFFFFF"/>
           <w:sz w:val="20"/>
         </w:rPr>
-        <w:t>${signfield:1:y:______________________}</w:t>
+        <w:t>${signfield:1:y:signature_issuer:220:64}</w:t>
       </w:r>
     </w:p>
     <w:p>
       <w:pPr>
-        <w:spacing w:after="20"/>
+        <w:spacing w:after="120"/>
         <w:jc w:val="left"/>
       </w:pPr>
       <w:r>
@@ -365,7 +365,7 @@
           <w:rFonts w:ascii="Helvetica" w:hAnsi="Helvetica"/>
           <w:b w:val="0"/>
           <w:color w:val="FFFFFF"/>
-          <w:sz w:val="20"/>
+          <w:sz w:val="40"/>
         </w:rPr>
         <w:t>_SIGNET_SIGNATURE_ISSUER_HERE_</w:t>
       </w:r>
@@ -410,12 +410,12 @@
           <w:color w:val="FFFFFF"/>
           <w:sz w:val="20"/>
         </w:rPr>
-        <w:t>${datefield:1:y:Date_Signed:__________}</w:t>
+        <w:t>${datefield:1:y:Date_Signed:130:30}</w:t>
       </w:r>
     </w:p>
     <w:p>
       <w:pPr>
-        <w:spacing w:after="20"/>
+        <w:spacing w:after="40"/>
         <w:jc w:val="left"/>
       </w:pPr>
       <w:r>
@@ -423,7 +423,7 @@
           <w:rFonts w:ascii="Helvetica" w:hAnsi="Helvetica"/>
           <w:b w:val="0"/>
           <w:color w:val="FFFFFF"/>
-          <w:sz w:val="20"/>
+          <w:sz w:val="26"/>
         </w:rPr>
         <w:t>_SIGNET_DATE_ISSUER_HERE_</w:t>
       </w:r>

</xml_diff>

<commit_message>
Read enrolment out of the thread it arrived in, and print each field beside the line it came from
</commit_message>
<xml_diff>
--- a/assets/signet-authorisation.docx
+++ b/assets/signet-authorisation.docx
@@ -182,6 +182,132 @@
           <w:sz w:val="18"/>
         </w:rPr>
         <w:t>{!Enrolment.Diligence}</w:t>
+      </w:r>
+    </w:p>
+    <w:p>
+      <w:pPr>
+        <w:spacing w:after="80"/>
+        <w:jc w:val="left"/>
+      </w:pPr>
+      <w:r>
+        <w:rPr>
+          <w:rFonts w:ascii="Helvetica" w:hAnsi="Helvetica"/>
+          <w:b/>
+          <w:sz w:val="18"/>
+        </w:rPr>
+        <w:t>HOW THIS WAS READ</w:t>
+      </w:r>
+    </w:p>
+    <w:p>
+      <w:pPr>
+        <w:spacing w:after="160"/>
+        <w:jc w:val="left"/>
+      </w:pPr>
+      <w:r>
+        <w:rPr>
+          <w:rFonts w:ascii="Helvetica" w:hAnsi="Helvetica"/>
+          <w:b w:val="0"/>
+          <w:sz w:val="18"/>
+        </w:rPr>
+        <w:t>Each field above was read out of the request as it arrived. The line it came from is printed beside it. Correct anything that is wrong before signing.</w:t>
+      </w:r>
+    </w:p>
+    <w:p>
+      <w:pPr>
+        <w:spacing w:after="40"/>
+        <w:jc w:val="left"/>
+      </w:pPr>
+      <w:r>
+        <w:rPr>
+          <w:rFonts w:ascii="Helvetica" w:hAnsi="Helvetica"/>
+          <w:b w:val="0"/>
+          <w:sz w:val="20"/>
+        </w:rPr>
+        <w:t>&lt;mdoc:repeater name="readings" value="{!Enrolment.Readings}" variable="item" mode="standard"&gt;</w:t>
+      </w:r>
+    </w:p>
+    <w:p>
+      <w:pPr>
+        <w:spacing w:after="20"/>
+        <w:jc w:val="left"/>
+      </w:pPr>
+      <w:r>
+        <w:rPr>
+          <w:rFonts w:ascii="Helvetica" w:hAnsi="Helvetica"/>
+          <w:b/>
+          <w:sz w:val="18"/>
+        </w:rPr>
+        <w:t>{!#item#.Field}   {!#item#.Value}</w:t>
+      </w:r>
+    </w:p>
+    <w:p>
+      <w:pPr>
+        <w:spacing w:after="120"/>
+        <w:jc w:val="left"/>
+      </w:pPr>
+      <w:r>
+        <w:rPr>
+          <w:rFonts w:ascii="Helvetica" w:hAnsi="Helvetica"/>
+          <w:b w:val="0"/>
+          <w:sz w:val="16"/>
+        </w:rPr>
+        <w:t xml:space="preserve">   read from "{!#item#.Quote}"   ·   {!#item#.Note}</w:t>
+      </w:r>
+    </w:p>
+    <w:p>
+      <w:pPr>
+        <w:spacing w:after="160"/>
+        <w:jc w:val="left"/>
+      </w:pPr>
+      <w:r>
+        <w:rPr>
+          <w:rFonts w:ascii="Helvetica" w:hAnsi="Helvetica"/>
+          <w:b w:val="0"/>
+          <w:sz w:val="20"/>
+        </w:rPr>
+        <w:t>&lt;/mdoc:repeater name="readings"&gt;</w:t>
+      </w:r>
+    </w:p>
+    <w:p>
+      <w:pPr>
+        <w:spacing w:after="40"/>
+        <w:jc w:val="left"/>
+      </w:pPr>
+      <w:r>
+        <w:rPr>
+          <w:rFonts w:ascii="Helvetica" w:hAnsi="Helvetica"/>
+          <w:b w:val="0"/>
+          <w:sz w:val="20"/>
+        </w:rPr>
+        <w:t>&lt;mdoc:paragraph name="ambiguous" hidden="{!$toDecimal(sum(Enrolment.Readings, "Uncertain")) &lt; 1}"&gt;</w:t>
+      </w:r>
+    </w:p>
+    <w:p>
+      <w:pPr>
+        <w:spacing w:after="40"/>
+        <w:jc w:val="left"/>
+      </w:pPr>
+      <w:r>
+        <w:rPr>
+          <w:rFonts w:ascii="Helvetica" w:hAnsi="Helvetica"/>
+          <w:b/>
+          <w:sz w:val="18"/>
+        </w:rPr>
+        <w:t>At least one field above had more than one possible reading in the text. Those lines name the reading that was rejected. Check them against what you meant before putting your name to this.</w:t>
+      </w:r>
+    </w:p>
+    <w:p>
+      <w:pPr>
+        <w:spacing w:after="280"/>
+        <w:jc w:val="left"/>
+      </w:pPr>
+      <w:r>
+        <w:rPr>
+          <w:rFonts w:ascii="Helvetica" w:hAnsi="Helvetica"/>
+          <w:b w:val="0"/>
+          <w:sz w:val="20"/>
+        </w:rPr>
+        <w:t>&lt;/mdoc:paragraph name="ambiguous"&gt;</w:t>
       </w:r>
     </w:p>
     <w:p>

</xml_diff>

<commit_message>
Give the signing block its own page and size both gateways against the line they sit on
</commit_message>
<xml_diff>
--- a/assets/signet-authorisation.docx
+++ b/assets/signet-authorisation.docx
@@ -353,6 +353,11 @@
       </w:r>
     </w:p>
     <w:p>
+      <w:r>
+        <w:br w:type="page"/>
+      </w:r>
+    </w:p>
+    <w:p>
       <w:pPr>
         <w:spacing w:after="200"/>
         <w:jc w:val="left"/>
@@ -478,7 +483,7 @@
           <w:color w:val="FFFFFF"/>
           <w:sz w:val="20"/>
         </w:rPr>
-        <w:t>${signfield:1:y:signature_issuer:220:64}</w:t>
+        <w:t>${signfield:1:y:signature_issuer:310:50}</w:t>
       </w:r>
     </w:p>
     <w:p>
@@ -491,9 +496,9 @@
           <w:rFonts w:ascii="Helvetica" w:hAnsi="Helvetica"/>
           <w:b w:val="0"/>
           <w:color w:val="FFFFFF"/>
-          <w:sz w:val="40"/>
+          <w:sz w:val="44"/>
         </w:rPr>
-        <w:t>_SIGNET_SIGNATURE_ISSUER_HERE_</w:t>
+        <w:t>_SIGNET_SIGN_HERE_</w:t>
       </w:r>
     </w:p>
     <w:p>
@@ -536,7 +541,7 @@
           <w:color w:val="FFFFFF"/>
           <w:sz w:val="20"/>
         </w:rPr>
-        <w:t>${datefield:1:y:Date_Signed:130:30}</w:t>
+        <w:t>${datefield:1:y:Date_Signed:200:34}</w:t>
       </w:r>
     </w:p>
     <w:p>
@@ -549,9 +554,9 @@
           <w:rFonts w:ascii="Helvetica" w:hAnsi="Helvetica"/>
           <w:b w:val="0"/>
           <w:color w:val="FFFFFF"/>
-          <w:sz w:val="26"/>
+          <w:sz w:val="32"/>
         </w:rPr>
-        <w:t>_SIGNET_DATE_ISSUER_HERE_</w:t>
+        <w:t>_SIGNET_DATE_</w:t>
       </w:r>
     </w:p>
     <w:p>

</xml_diff>

<commit_message>
Size the Foxit fields the way the ones that render correctly are sized, and sign last
</commit_message>
<xml_diff>
--- a/assets/signet-authorisation.docx
+++ b/assets/signet-authorisation.docx
@@ -459,7 +459,65 @@
     </w:p>
     <w:p>
       <w:pPr>
+        <w:spacing w:after="120"/>
+        <w:jc w:val="left"/>
+      </w:pPr>
+      <w:r>
+        <w:rPr>
+          <w:rFonts w:ascii="Helvetica" w:hAnsi="Helvetica"/>
+          <w:b/>
+          <w:sz w:val="18"/>
+        </w:rPr>
+        <w:t>Date</w:t>
+      </w:r>
+    </w:p>
+    <w:p>
+      <w:pPr>
+        <w:spacing w:after="20"/>
+        <w:jc w:val="left"/>
+      </w:pPr>
+      <w:r>
+        <w:rPr>
+          <w:rFonts w:ascii="Helvetica" w:hAnsi="Helvetica"/>
+          <w:b w:val="0"/>
+          <w:color w:val="FFFFFF"/>
+          <w:sz w:val="20"/>
+        </w:rPr>
+        <w:t>${datefield:1:y:Date_Signed:______________}</w:t>
+      </w:r>
+    </w:p>
+    <w:p>
+      <w:pPr>
         <w:spacing w:after="40"/>
+        <w:jc w:val="left"/>
+      </w:pPr>
+      <w:r>
+        <w:rPr>
+          <w:rFonts w:ascii="Helvetica" w:hAnsi="Helvetica"/>
+          <w:b w:val="0"/>
+          <w:color w:val="FFFFFF"/>
+          <w:sz w:val="32"/>
+        </w:rPr>
+        <w:t>_SIGNET_DATE_</w:t>
+      </w:r>
+    </w:p>
+    <w:p>
+      <w:pPr>
+        <w:spacing w:after="320"/>
+        <w:jc w:val="left"/>
+      </w:pPr>
+      <w:r>
+        <w:rPr>
+          <w:rFonts w:ascii="Helvetica" w:hAnsi="Helvetica"/>
+          <w:b w:val="0"/>
+          <w:sz w:val="20"/>
+        </w:rPr>
+        <w:t>______________________________</w:t>
+      </w:r>
+    </w:p>
+    <w:p>
+      <w:pPr>
+        <w:spacing w:after="200"/>
         <w:jc w:val="left"/>
       </w:pPr>
       <w:r>
@@ -483,7 +541,7 @@
           <w:color w:val="FFFFFF"/>
           <w:sz w:val="20"/>
         </w:rPr>
-        <w:t>${signfield:1:y:signature_issuer:310:50}</w:t>
+        <w:t>${signfield:1:y:signature_issuer:_____________________}</w:t>
       </w:r>
     </w:p>
     <w:p>
@@ -503,7 +561,7 @@
     </w:p>
     <w:p>
       <w:pPr>
-        <w:spacing w:after="200"/>
+        <w:spacing w:after="0"/>
         <w:jc w:val="left"/>
       </w:pPr>
       <w:r>
@@ -513,64 +571,6 @@
           <w:sz w:val="20"/>
         </w:rPr>
         <w:t>______________________________________________</w:t>
-      </w:r>
-    </w:p>
-    <w:p>
-      <w:pPr>
-        <w:spacing w:after="40"/>
-        <w:jc w:val="left"/>
-      </w:pPr>
-      <w:r>
-        <w:rPr>
-          <w:rFonts w:ascii="Helvetica" w:hAnsi="Helvetica"/>
-          <w:b/>
-          <w:sz w:val="18"/>
-        </w:rPr>
-        <w:t>Date</w:t>
-      </w:r>
-    </w:p>
-    <w:p>
-      <w:pPr>
-        <w:spacing w:after="20"/>
-        <w:jc w:val="left"/>
-      </w:pPr>
-      <w:r>
-        <w:rPr>
-          <w:rFonts w:ascii="Helvetica" w:hAnsi="Helvetica"/>
-          <w:b w:val="0"/>
-          <w:color w:val="FFFFFF"/>
-          <w:sz w:val="20"/>
-        </w:rPr>
-        <w:t>${datefield:1:y:Date_Signed:200:34}</w:t>
-      </w:r>
-    </w:p>
-    <w:p>
-      <w:pPr>
-        <w:spacing w:after="40"/>
-        <w:jc w:val="left"/>
-      </w:pPr>
-      <w:r>
-        <w:rPr>
-          <w:rFonts w:ascii="Helvetica" w:hAnsi="Helvetica"/>
-          <w:b w:val="0"/>
-          <w:color w:val="FFFFFF"/>
-          <w:sz w:val="32"/>
-        </w:rPr>
-        <w:t>_SIGNET_DATE_</w:t>
-      </w:r>
-    </w:p>
-    <w:p>
-      <w:pPr>
-        <w:spacing w:after="0"/>
-        <w:jc w:val="left"/>
-      </w:pPr>
-      <w:r>
-        <w:rPr>
-          <w:rFonts w:ascii="Helvetica" w:hAnsi="Helvetica"/>
-          <w:b w:val="0"/>
-          <w:sz w:val="20"/>
-        </w:rPr>
-        <w:t>______________________________</w:t>
       </w:r>
     </w:p>
     <w:sectPr>

</xml_diff>